<commit_message>
artigo: aplicar correções do PIT e regra de discrepância do ISS nas tabelas per capita
Co-Authored-By: Claude Sonnet 5.5 <noreply@anthropic.com>
Claude-Session: https://claude.ai/code/session_01TurhZD9BT23fwW9Mjr8E7S
</commit_message>
<xml_diff>
--- a/data/auditoria-pr-validacao/tabelas-artigo/tabelas-dispersao-percapita-pr.docx
+++ b/data/auditoria-pr-validacao/tabelas-artigo/tabelas-dispersao-percapita-pr.docx
@@ -1321,7 +1321,7 @@
               <w:rPr>
                 <w:sz w:val="18"/>
               </w:rPr>
-              <w:t>359. Grandes Rios</w:t>
+              <w:t>360. Grandes Rios</w:t>
             </w:r>
           </w:p>
         </w:tc>
@@ -1431,7 +1431,7 @@
               <w:rPr>
                 <w:sz w:val="18"/>
               </w:rPr>
-              <w:t>360. Japira</w:t>
+              <w:t>361. Japira</w:t>
             </w:r>
           </w:p>
         </w:tc>
@@ -1541,7 +1541,7 @@
               <w:rPr>
                 <w:sz w:val="18"/>
               </w:rPr>
-              <w:t>361. Iguatu</w:t>
+              <w:t>362. Iguatu</w:t>
             </w:r>
           </w:p>
         </w:tc>
@@ -1651,7 +1651,7 @@
               <w:rPr>
                 <w:sz w:val="18"/>
               </w:rPr>
-              <w:t>362. Arapuã</w:t>
+              <w:t>363. Arapuã</w:t>
             </w:r>
           </w:p>
         </w:tc>
@@ -1761,7 +1761,7 @@
               <w:rPr>
                 <w:sz w:val="18"/>
               </w:rPr>
-              <w:t>363. Amaporã</w:t>
+              <w:t>364. Amaporã</w:t>
             </w:r>
           </w:p>
         </w:tc>
@@ -1871,7 +1871,7 @@
               <w:rPr>
                 <w:sz w:val="18"/>
               </w:rPr>
-              <w:t>364. Santana do Itararé</w:t>
+              <w:t>365. Santana do Itararé</w:t>
             </w:r>
           </w:p>
         </w:tc>
@@ -1981,7 +1981,7 @@
               <w:rPr>
                 <w:sz w:val="18"/>
               </w:rPr>
-              <w:t>365. Rancho Alegre D'Oeste</w:t>
+              <w:t>366. Rancho Alegre D'Oeste</w:t>
             </w:r>
           </w:p>
         </w:tc>
@@ -2091,7 +2091,7 @@
               <w:rPr>
                 <w:sz w:val="18"/>
               </w:rPr>
-              <w:t>366. Salto do Itararé</w:t>
+              <w:t>367. Salto do Itararé</w:t>
             </w:r>
           </w:p>
         </w:tc>
@@ -2201,7 +2201,7 @@
               <w:rPr>
                 <w:sz w:val="18"/>
               </w:rPr>
-              <w:t>367. Santa Inês</w:t>
+              <w:t>368. Santa Inês</w:t>
             </w:r>
           </w:p>
         </w:tc>
@@ -2314,7 +2314,7 @@
               <w:rPr>
                 <w:sz w:val="18"/>
               </w:rPr>
-              <w:t>368. Iracema do Oeste</w:t>
+              <w:t>369. Iracema do Oeste</w:t>
             </w:r>
           </w:p>
         </w:tc>
@@ -3744,7 +3744,7 @@
               <w:rPr>
                 <w:sz w:val="18"/>
               </w:rPr>
-              <w:t>359. Porecatu</w:t>
+              <w:t>360. Porecatu</w:t>
             </w:r>
           </w:p>
         </w:tc>
@@ -3854,7 +3854,7 @@
               <w:rPr>
                 <w:sz w:val="18"/>
               </w:rPr>
-              <w:t>360. Fazenda Rio Grande</w:t>
+              <w:t>361. Fazenda Rio Grande</w:t>
             </w:r>
           </w:p>
         </w:tc>
@@ -3964,7 +3964,7 @@
               <w:rPr>
                 <w:sz w:val="18"/>
               </w:rPr>
-              <w:t>361. Figueira</w:t>
+              <w:t>362. Figueira</w:t>
             </w:r>
           </w:p>
         </w:tc>
@@ -4074,7 +4074,7 @@
               <w:rPr>
                 <w:sz w:val="18"/>
               </w:rPr>
-              <w:t>362. Matinhos</w:t>
+              <w:t>363. Matinhos</w:t>
             </w:r>
           </w:p>
         </w:tc>
@@ -4184,7 +4184,7 @@
               <w:rPr>
                 <w:sz w:val="18"/>
               </w:rPr>
-              <w:t>363. Colombo</w:t>
+              <w:t>364. Colombo</w:t>
             </w:r>
           </w:p>
         </w:tc>
@@ -4294,7 +4294,7 @@
               <w:rPr>
                 <w:sz w:val="18"/>
               </w:rPr>
-              <w:t>364. Paiçandu</w:t>
+              <w:t>365. Paiçandu</w:t>
             </w:r>
           </w:p>
         </w:tc>
@@ -4404,7 +4404,7 @@
               <w:rPr>
                 <w:sz w:val="18"/>
               </w:rPr>
-              <w:t>365. Pontal do Paraná</w:t>
+              <w:t>366. Pontal do Paraná</w:t>
             </w:r>
           </w:p>
         </w:tc>
@@ -4514,7 +4514,7 @@
               <w:rPr>
                 <w:sz w:val="18"/>
               </w:rPr>
-              <w:t>366. Itaperuçu</w:t>
+              <w:t>367. Itaperuçu</w:t>
             </w:r>
           </w:p>
         </w:tc>
@@ -4624,7 +4624,7 @@
               <w:rPr>
                 <w:sz w:val="18"/>
               </w:rPr>
-              <w:t>367. Almirante Tamandaré</w:t>
+              <w:t>368. Almirante Tamandaré</w:t>
             </w:r>
           </w:p>
         </w:tc>
@@ -4737,7 +4737,7 @@
               <w:rPr>
                 <w:sz w:val="18"/>
               </w:rPr>
-              <w:t>368. Sarandi</w:t>
+              <w:t>369. Sarandi</w:t>
             </w:r>
           </w:p>
         </w:tc>
@@ -4884,7 +4884,7 @@
           <w:i w:val="0"/>
           <w:sz w:val="18"/>
         </w:rPr>
-        <w:t>Painel A – 368 municípios com dados auditados</w:t>
+        <w:t>Painel A – 369 municípios com dados auditados</w:t>
       </w:r>
     </w:p>
     <w:tbl>
@@ -5476,7 +5476,7 @@
               <w:rPr>
                 <w:sz w:val="18"/>
               </w:rPr>
-              <w:t>0,231</w:t>
+              <w:t>0,230</w:t>
             </w:r>
           </w:p>
         </w:tc>
@@ -6206,7 +6206,7 @@
           <w:i/>
           <w:sz w:val="16"/>
         </w:rPr>
-        <w:t>Fonte: elaboração própria. Valores em R$ constantes de 2025; população fixa (média 2019-2026); 2033 e 2077 conforme o cronograma do art. 131 do ADCT (EC 132/2023) e crescimento real do PIB de 2,2% a.a. após 2033. Excluídos: municípios sem ISS de 2025 observado diretamente, com pendência de auditoria, com menos de 5 anos de ISS observado ou com salto atípico do ISS em 2025 (Guaraqueçaba, a confirmar no PIT/TCE-PR).</w:t>
+        <w:t>Fonte: elaboração própria. Valores em R$ constantes de 2025; população fixa (média 2019-2026); 2033 e 2077 conforme o cronograma do art. 131 do ADCT (EC 132/2023) e crescimento real do PIB de 2,2% a.a. após 2033. Excluídos: municípios sem ISS de 2025 observado diretamente, com pendência de auditoria ou com menos de 5 anos de ISS observado. ISS discrepante (&gt;= 5x ou &lt;= 0,2x a mediana dos demais anos) substituído pelo PIT/TCE-PR quando a divergência supera 20%.</w:t>
       </w:r>
     </w:p>
     <w:sectPr>

</xml_diff>